<commit_message>
v87 JIK: apply the independent review, finish the delivery set
The Korean abstract now limits the core-technology comparison to
bonding applications, as the English abstract and Table 4 do. The
merged Table 6 caption and note scope the supplementary coefficients to
the multinomial logit and restore the core model's sample. The 6.3
limitation no longer implies a false causal link. Korean abbreviations
(AUC, AIC, PCT, TSV, SOI) are spelled out, "irrelevant uses" is
defined in 4.1, and a few references lost in condensing are restored.
English copy edits in 2.4, 4.3, 4.5 and 5.3. Summary of v87 changes in
condense_v87_ko. All builds FAILS 0; EN 30 pages, KO 28.

Co-Authored-By: Claude Opus 5.5 <noreply@anthropic.com>
Claude-Session: https://claude.ai/code/session_01SvckvZxt3hAXTDPnm8YPEC
</commit_message>
<xml_diff>
--- a/journal/manuscript_v87_en_JIK.docx
+++ b/journal/manuscript_v87_en_JIK.docx
@@ -260,7 +260,7 @@
         <w:pStyle w:val="BodyText"/>
       </w:pPr>
       <w:r>
-        <w:t xml:space="preserve">Hybrid bonding is precisely such a technology. Because its yield depends on front-end capabilities such as planarization, surface chemistry, and alignment, the interface between fabrication and packaging is no longer stable, as anticipated in research on the limits of scaling (Arden et al., 2010; Iyer, 2016; Khan et al., 2018) and documented in packaging engineering research (Lau, 2021, 2022), although few studies have observed this phenomenon in the record of invention. In terms of the stage model, knowledge convergence in hybrid bonding corresponds to the application of fabrication-process knowledge such as planarization and surface activation to chip-to-chip connection; technological convergence, to the combination of this knowledge with bonded structures within a single invention; applicational convergence, to the implementation of the combined technology in products such as image sensors, 3D NAND, HBM, and chiplets; and industrial convergence, to the reorganization of the division of labor, as when leading foundries internalize advanced packaging (KnowMade, 2024; Lau, 2022). Of these, only technological convergence can be observed directly through patent co-classification; applicational convergence is addressed only indirectly, through shifts in the locus of knowledge integration, and industrial convergence lies outside the scope of the analysis. If the interface has become unstable, inventions incorporating knowledge from both stages should not be exceptional, and such inventions should combine more diverse technical elements than inventions confined to one domain.</w:t>
+        <w:t xml:space="preserve">Hybrid bonding is precisely a technology that makes the performance of one stage depend on the knowledge of another. Because its yield depends on front-end capabilities such as planarization, surface chemistry, and alignment, the interface between fabrication and packaging is no longer stable, as anticipated in research on the limits of scaling (Arden et al., 2010; Iyer, 2016; Khan et al., 2018) and documented in packaging engineering research (Lau, 2021, 2022), although few studies have observed this phenomenon in the record of invention. In terms of the stage model, knowledge convergence in hybrid bonding corresponds to the application of fabrication-process knowledge such as planarization and surface activation to chip-to-chip connection; technological convergence, to the combination of this knowledge with bonded structures within a single invention; applicational convergence, to the implementation of the combined technology in products such as image sensors, 3D NAND, HBM, and chiplets; and industrial convergence, to the reorganization of the division of labor, as when leading foundries internalize advanced packaging (KnowMade, 2024; Lau, 2022). Of these, only technological convergence can be observed directly through patent co-classification; applicational convergence is addressed only indirectly, through shifts in the locus of knowledge integration, and industrial convergence lies outside the scope of the analysis. If the interface has become unstable, inventions incorporating knowledge from both stages should not be exceptional, and such inventions should combine more diverse technical elements than inventions confined to one domain.</w:t>
       </w:r>
     </w:p>
     <w:bookmarkEnd w:id="12"/>
@@ -286,7 +286,7 @@
         <w:pStyle w:val="BodyText"/>
       </w:pPr>
       <w:r>
-        <w:t xml:space="preserve">Changes in convergence may also appear in the relationships among the elements that make up a technology. Murmann and Frenken (2006) define a dominant design as the stabilized design of the core elements, which are closely linked to other elements and serve as stable interfaces, and once the core design has stabilized, subsequent technological change can continue in the peripheral elements, taking those interfaces as given. The core element of hybrid bonding is a connection scheme in which bonding pads are bonded directly to one another without bumps or solder (Lau, 2021), and inventing it in an era of ferment, when the interfaces are not yet settled, requires dealing with fabrication-process knowledge such as surface planarization and wafer bonding. Once a dominant design has been established, however, architectural knowledge is taken for granted (Henderson &amp; Clark, 1990), and as interdependencies among components become predictable, the need to handle knowledge from the other side of the boundary decreases (Brusoni et al., 2001). Because hybrid bonding was first commercialized in wafer-level bonding and later extended to die-level bonding (Lau, 2021, 2022), later filings are more likely to belong to a stage in which the core design has become entrenched.</w:t>
+        <w:t xml:space="preserve">Changes in convergence may also appear in the relationships among the elements that make up a technology. Murmann and Frenken (2006) defined a dominant design as the stabilized design of the core elements, which, unlike peripheral elements, are closely linked to other elements and serve as stable interfaces, and once the core design has stabilized, subsequent technological change can continue in the peripheral elements, taking those interfaces as given. The core element of hybrid bonding is a connection scheme in which bonding pads are bonded directly to one another without bumps or solder (Lau, 2021), and inventing it in an era of ferment, when the interfaces are not yet settled, requires dealing with fabrication-process knowledge such as surface planarization and wafer bonding. Once a dominant design has been established, however, architectural knowledge is taken for granted (Henderson &amp; Clark, 1990), and as interdependencies among components become predictable, the need to handle knowledge from the other side of the boundary decreases (Brusoni et al., 2001). Because hybrid bonding was first commercialized in wafer-level bonding and later extended to die-level bonding (Lau, 2021, 2022), later filings are more likely to belong to a stage in which the core design has become entrenched.</w:t>
       </w:r>
     </w:p>
     <w:p>
@@ -320,7 +320,7 @@
         <w:pStyle w:val="BodyText"/>
       </w:pPr>
       <w:r>
-        <w:t xml:space="preserve">This study instead classifies individual patents into three types. The process-only type represents fabrication-process knowledge for bonding that develops separately from bonding technology, and the integrated type knowledge from both domains combined within a single invention. A bonding-only application may be a bonding invention not yet combined with fabrication-process knowledge or one in which, the interface having become entrenched, such knowledge is taken as given, so type shares should be interpreted together with changes in composition over filing periods. Defining the types at the level of the individual patent allows discrete choice models to be applied and preserves differences between patents.</w:t>
+        <w:t xml:space="preserve">This study instead classifies individual patents into three types. The process-only type represents fabrication-process knowledge for bonding that develops separately from bonding technology, and the integrated type represents knowledge from both domains combined within a single invention. A bonding-only application may be a bonding invention not yet combined with fabrication-process knowledge or one in which, the interface having become entrenched, such knowledge is taken as given, so type shares should be interpreted together with changes in composition over filing periods. Defining the types at the level of the individual patent allows discrete choice models to be applied and preserves differences between patents.</w:t>
       </w:r>
     </w:p>
     <w:p>
@@ -328,7 +328,7 @@
         <w:pStyle w:val="BodyText"/>
       </w:pPr>
       <w:r>
-        <w:t xml:space="preserve">The core technologies are identified with technology cluster and network analyses (Section 4.4). Treating classification symbols as nodes and pairs of jointly assigned symbols as links represents the structure of combinations among technical elements (Sternitzke et al., 2008), and the frequency of joint assignment reflects knowledge relatedness (Breschi et al., 2003). Treating the most strongly linked symbols as core technologies approximates Murmann and Frenken’s (2006) concept of core elements within this structure, and period-to-period changes in the symbols that link different symbols indicate the locus of knowledge integration. Technological scope restricts Lerner’s (1994) approach of measuring patent scope by the number of classification symbols to the number of subgroups within the two classes (Hall &amp; Ziedonis, 2001; Ziedonis, 2004); because an integrated application by definition carries at least one symbol of each class, the relationship between technological scope and type has a mechanical aspect (Sections 4.3 and 5.4).</w:t>
+        <w:t xml:space="preserve">The core technologies are identified with technology cluster and network analyses (Section 4.4). Treating classification symbols as nodes and pairs of jointly assigned symbols as links represents the structure of combinations among technical elements (Sternitzke et al., 2008), and the frequency of joint assignment reflects knowledge relatedness (Breschi et al., 2003). Treating the most strongly linked symbols as core technologies approximates Murmann and Frenken’s (2006) concept of core elements within this structure, and period-to-period changes in the symbols that link different symbols indicate the locus of knowledge integration. Technological scope adapts Lerner’s (1994) count of classification symbols as a measure of patent scope, restricting it to subgroups within the two classes (Hall &amp; Ziedonis, 2001; Ziedonis, 2004); because an integrated application by definition carries at least one symbol of each class, the relationship between technological scope and type has a mechanical aspect (Sections 4.3 and 5.4).</w:t>
       </w:r>
     </w:p>
     <w:bookmarkEnd w:id="14"/>
@@ -652,7 +652,7 @@
         <w:t xml:space="preserve">hybrid bonding</w:t>
       </w:r>
       <w:r>
-        <w:t xml:space="preserve">), such as direct bonded copper (DBC) substrates and power modules (Section S1 of the Supplementary material). Third, because the records lack patent family identifiers, the same invention filed at several offices is counted as several applications; this was checked with a sample that keeps only the earliest application among those sharing the same title and with standard errors clustered by title. The 928 applications comprise 473 unique titles, of which 149 were filed at two or more offices.</w:t>
+        <w:t xml:space="preserve">), such as direct bonded copper (DBC) substrates and power modules (hereafter irrelevant uses; Section S1 of the Supplementary material). Third, because the records lack patent family identifiers, the same invention filed at several offices is counted as several applications; this was checked with a sample that keeps only the earliest application among those sharing the same title and with standard errors clustered by title. The 928 applications comprise 473 unique titles, of which 149 were filed at two or more offices.</w:t>
       </w:r>
     </w:p>
     <w:bookmarkEnd w:id="22"/>
@@ -700,7 +700,7 @@
         <w:pStyle w:val="FirstParagraph"/>
       </w:pPr>
       <w:r>
-        <w:t xml:space="preserve">The variables are defined in Table 1. Technological scope (breadth) represents the diversity of the technical elements assigned to an application within the two classes; it measures neither the extent to which the application extends into fields beyond semiconductors nor the legal scope of its claims. Because type and technological scope are derived from the same CPC information, the minimum breadth of an integrated application is two, whereas that of a single-class type is one. To mitigate this mechanical difference, a type-minimum-adjusted CPC scope (breadth_adj) was constructed by subtracting one symbol for each class that an application carries; because this indicator also uses type information, it is used only as an exploratory robustness indicator. Filing period (period) groups 1968–2014, when filings were sparse, into a single period and divides the subsequent years into five-year periods, and because filing periods and technological composition differ across filing offices, filing office (ccode) is included as a control variable in all models, but its coefficients are not interpreted. Technological scope averages 5.69 symbols (standard deviation 4.07): 7.89 for integrated, 4.16 for bonding-only, and 3.15 for process-only applications. Applications surged in the late 2010s and peaked around 2022 (Figure 2); the numbers of applications by filing office are given in Table 1.</w:t>
+        <w:t xml:space="preserve">The variables are defined in Table 1. Technological scope (breadth) represents the diversity of the technical elements assigned to an application within the two classes; it measures neither the extent to which the application extends into fields beyond semiconductors nor the legal scope of its claims. Because type and technological scope are derived from the same CPC information, the minimum breadth of an integrated application is two, whereas that of a single-class type is one. To mitigate this mechanical difference, a type-minimum-adjusted CPC scope (breadth_adj) was constructed by subtracting one symbol for each class that an application carries; because this indicator also uses type information, it is used only as an exploratory robustness indicator. Filing period (period) groups 1968–2014, when filings were sparse, into a single period and divides the subsequent years into five-year periods. Because filing periods and technological composition differ across filing offices, filing office (ccode) is included as a control variable in all models, but its coefficients are not interpreted. Technological scope averages 5.69 symbols (standard deviation 4.07): 7.89 for integrated, 4.16 for bonding-only, and 3.15 for process-only applications. Applications surged in the late 2010s and peaked around 2022 (Figure 2); the numbers of applications by filing office are given in Table 1.</w:t>
       </w:r>
     </w:p>
     <w:p>
@@ -3453,7 +3453,7 @@
         <w:pStyle w:val="BodyText"/>
       </w:pPr>
       <w:r>
-        <w:t xml:space="preserve">The shift in the locus of knowledge integration is examined with two supplementary indicators calculated by period. The Jaccard coefficient (Jaccard, 1912) measures how often symbols of each of the three fabrication-process domains (wafer fabrication, processing apparatus, and packaging-stage processes) are assigned to the same application as bonding symbols and thus indicates how strongly each fabrication-process knowledge domain is integrated with bonding knowledge. In the period-specific technology networks, symbols with a large connection strength are regarded as hubs and symbols with high betweenness centrality (Freeman, 1977) as linking symbols that connect different symbols, which indicates the locus of integration; betweenness centrality is calculated without considering link weights.</w:t>
+        <w:t xml:space="preserve">The shift in the locus of knowledge integration is examined with two supplementary indicators calculated by period. The Jaccard coefficient (Jaccard, 1912) measures how often symbols of each of the three fabrication-process domains (wafer fabrication, processing apparatus, and packaging-stage processes) are assigned to the same application as bonding symbols and thus indicates how strongly each fabrication-process knowledge domain is integrated with bonding knowledge. In the period-specific technology networks, symbols with a large connection strength are regarded as hubs and symbols with high betweenness centrality (Freeman, 1977) as linking symbols that connect different symbols and thus indicate the locus of integration; betweenness centrality is calculated without considering link weights.</w:t>
       </w:r>
     </w:p>
     <w:p>
@@ -4690,7 +4690,7 @@
         <w:pStyle w:val="BodyText"/>
       </w:pPr>
       <w:r>
-        <w:t xml:space="preserve">This shift is also evident in the fabrication-process domains as a whole and in the technology network (Table 5). The Jaccard coefficient of wafer fabrication with bonding symbols peaked at 0.598 in the diffusion phase and then dropped sharply to 0.159 in the reconfiguration phase, whereas those of processing apparatus and packaging-stage processes rose steadily; from the diffusion to the reconfiguration phase, the number of applications in which a domain’s symbols were assigned together with bonding symbols decreased from 119 to 82 for wafer fabrication but increased from 11 to 89 for processing apparatus and from 43 to 139 for packaging-stage processes. In the technology network, the three symbols with the greatest connection strength were core symbols (24/80, 24/08, and 24/05) in all three periods, whereas the share of betweenness centrality accounted for by wafer fabrication symbols fell from 53.6% in the formation phase and 42.5% in the diffusion phase to 9.0% in the reconfiguration phase, when processing apparatus symbols accounted for 26.1%. Of the five fabrication-process symbols with the highest betweenness centrality in the reconfiguration phase, four were processing apparatus symbols (21/67121, 21/67766, 21/67092, and 21/6835) and one was a packaging-stage process symbol (21/50), and the direction was the same with the reciprocals of the link weights as distances. While the core technologies remained hubs, the locus of knowledge integration moved from wafer fabrication to processing apparatus and packaging-stage processes.</w:t>
+        <w:t xml:space="preserve">This shift is also evident in the fabrication-process domains as a whole and in the technology network (Table 5). The Jaccard coefficient of wafer fabrication with bonding symbols peaked at 0.598 in the diffusion phase and then dropped sharply to 0.159 in the reconfiguration phase, whereas those of processing apparatus and packaging-stage processes rose steadily; from the diffusion to the reconfiguration phase, the number of applications in which a domain’s symbols were assigned together with bonding symbols decreased from 119 to 82 for wafer fabrication but increased from 11 to 89 for processing apparatus and from 43 to 139 for packaging-stage processes. In the technology network, the three symbols with the greatest connection strength were core symbols (24/80, 24/08, and 24/05) in all three periods, whereas the share of betweenness centrality accounted for by wafer fabrication symbols fell from 53.6% in the formation phase and 42.5% in the diffusion phase to 9.0% in the reconfiguration phase, when processing apparatus symbols accounted for 26.1%. Of the five fabrication-process symbols with the highest betweenness centrality in the reconfiguration phase, four were processing apparatus symbols (21/67121, 21/67766, 21/67092, and 21/6835) and one was a packaging-stage process symbol (21/50), and the direction was the same when betweenness centrality was recalculated using the reciprocals of the link weights as distances. While the core technologies remained hubs, the locus of knowledge integration moved from wafer fabrication to processing apparatus and packaging-stage processes.</w:t>
       </w:r>
     </w:p>
     <w:p>
@@ -5675,7 +5675,7 @@
           <w:sz w:val="20"/>
           <w:szCs w:val="20"/>
         </w:rPr>
-        <w:t xml:space="preserve">Comparison of the re-estimation results (type model: multinomial logit RRRs, base category = bonding-only; core model: period-specific odds ratios of the core technologies and the 2020–2024 interaction, i.e., the multiple relative to 1968–2014; filing office dummies included; * p &lt; 0.10, ** p &lt; 0.05, *** p &lt; 0.01).</w:t>
+        <w:t xml:space="preserve">Comparison of the re-estimation results (type model: multinomial logit RRRs, base category = bonding-only; core model: applications with H01L24 symbols, period-specific odds ratios of the core technologies and the 2020–2024 interaction, i.e., the multiple relative to 1968–2014; filing office dummies included; * p &lt; 0.10, ** p &lt; 0.05, *** p &lt; 0.01).</w:t>
       </w:r>
     </w:p>
     <w:tbl>
@@ -7273,7 +7273,7 @@
           <w:sz w:val="20"/>
           <w:szCs w:val="20"/>
         </w:rPr>
-        <w:t xml:space="preserve">sample because it contains only 12 bonding applications without the core technologies up to 2019. The standard errors of the unclustered estimations, the remaining coefficients, and the results for the type-minimum-adjusted CPC scope (breadth_adj) are presented in Tables S4 and S5 of the Supplementary material.</w:t>
+        <w:t xml:space="preserve">sample because it contains only 12 bonding applications without the core technologies up to 2019. For the multinomial logit, the standard errors of the unclustered estimations, the remaining coefficients, and the results for the type-minimum-adjusted CPC scope (breadth_adj) are presented in Tables S4 and S5 of the Supplementary material.</w:t>
       </w:r>
     </w:p>
     <w:p>
@@ -8173,7 +8173,7 @@
         <w:pStyle w:val="FirstParagraph"/>
       </w:pPr>
       <w:r>
-        <w:t xml:space="preserve">This study has several limitations. First, the H01L21–H01L24 co-classification is an observable trace of knowledge integration within inventions; it does not measure knowledge transfer between organizations, firms’ absorptive capacity, or innovation performance. Because H01L21 includes packaging-stage processes and technological scope is derived from the same CPC information as the types, descriptive statistics such as the integrated share depend on the definition, although the regression results held under the narrow definition. Periodic CPC revisions and retroactive reclassification may also account for part of the observed change. Second, the title keyword search cannot capture applications whose titles lack relevant terms, and because the data lack patent family identifiers, duplicates were approximated with identical titles. Third, the regression data do not include applicants, firm types, nationalities, end-use areas, the distinction between wafer-level and die-level bonding, or CPC symbols outside the two classes. Fourth, this study does not claim causality. Diversity and type are likely to be jointly determined, and the period division approximates the emergence of a dominant design with filing periods whose boundaries were set in light of the concentration of filings. Because patent applications are generally published 18 months after their priority date, applications from the most recent years are not yet fully observed (Figure 2), and the results for the reconfiguration phase should be interpreted with the truncation of recent filings in mind. Fifth, CPC co-classification is reproducible but is assigned later than the invention itself, whereas text-based methods (Lei et al., 2019; Preschitschek et al., 2013; Zhu &amp; Motohashi, 2022) allow earlier detection but depend on trained models.</w:t>
+        <w:t xml:space="preserve">This study has several limitations. First, the H01L21–H01L24 co-classification is an observable trace of knowledge integration within inventions; it does not measure knowledge transfer between organizations, firms’ absorptive capacity, or innovation performance. Because H01L21 includes packaging-stage processes, descriptive statistics such as the integrated share depend on the definition, although the regression results held under the narrow definition; technological scope is also derived from the same CPC information as the types. Periodic CPC revisions and retroactive reclassification may also account for part of the observed change. Second, the title keyword search cannot capture applications whose titles lack relevant terms, and because the data lack patent family identifiers, duplicates were approximated with identical titles. Third, the regression data do not include applicants, firm types, nationalities, end-use areas, the distinction between wafer-level and die-level bonding, or CPC symbols outside the two classes. Fourth, this study does not claim causality. Diversity and type are likely to be jointly determined, and the period division approximates the emergence of a dominant design with filing periods whose boundaries were set in light of the concentration of filings. Because patent applications are generally published 18 months after their priority date, applications from the most recent years are not yet fully observed (Figure 2), and the results for the reconfiguration phase should be interpreted with the truncation of recent filings in mind. Fifth, CPC co-classification is reproducible but is assigned later than the invention itself, whereas text-based methods (Lei et al., 2019; Preschitschek et al., 2013; Zhu &amp; Motohashi, 2022) allow earlier detection but depend on trained models.</w:t>
       </w:r>
     </w:p>
     <w:p>

</xml_diff>